<commit_message>
simplify relaxation in boxes-advisor
</commit_message>
<xml_diff>
--- a/Wouldwork User Manual(26.8).docx
+++ b/Wouldwork User Manual(26.8).docx
@@ -6970,68 +6970,65 @@
         <w:t>scope</w:t>
       </w:r>
       <w:r>
-        <w:t xml:space="preserve"> in which its variables can appear in an action precondition, effect, or quantified formula.  Fluent variables ($) will never appear in a precondition or quantified formula parameter list, since their values are not generated.  Their binding is always established through the use of the </w:t>
+        <w:t xml:space="preserve"> in which its variables can appear in an action precondition, effect, or quantified formula.  </w:t>
+      </w:r>
+      <w:r>
+        <w:t>Fluent variables ($) never appear as generated variables in a parameter list, since their values are not generated. Their binding is established through bind, setq or setf. However, fluent variables can appear in action effect parameter lists to control how solution steps are printed, as mentioned above, and a fluent variable holding a list can supply the values for a quantified statement’s variable.</w:t>
+      </w:r>
+      <w:r>
+        <w:t xml:space="preserve">  </w:t>
+      </w:r>
+    </w:p>
+    <w:p>
+      <w:pPr>
+        <w:pStyle w:val="NoSpacing"/>
+      </w:pPr>
+    </w:p>
+    <w:p>
+      <w:pPr>
+        <w:pStyle w:val="NoSpacing"/>
+      </w:pPr>
+      <w:r>
+        <w:t>In the case of overlapping types, as in a blocks world parameter list like (?block block ?support support), some supports are blocks (all supports except the table T) and all blocks are supports.  For this situation, the default is to generate only relevant combinations of a block and a support—eg, (A B) or (A T), but not (T A) or (T T) or (A A)—for checking in an action rule.  For example, in the default case, there is no need to include a statement like (different ?block ?support) in the body of a rule.</w:t>
+      </w:r>
+    </w:p>
+    <w:p>
+      <w:pPr>
+        <w:pStyle w:val="NoSpacing"/>
+      </w:pPr>
+    </w:p>
+    <w:p>
+      <w:pPr>
+        <w:pStyle w:val="NoSpacing"/>
+      </w:pPr>
+      <w:r>
+        <w:t>Whenever the precondition of an action is satisfied for a particular instantiation of its variables, those instantiations are then available for use in the action’s effect.  In the jugs example, all of the precondition variable instantiations for ?jug, $amt, and $cap are automatically passed to the effect, and therefore do not need to appear in the effect parameter list, unless needed to appropriately print out solution steps.</w:t>
+      </w:r>
+    </w:p>
+    <w:p>
+      <w:pPr>
+        <w:pStyle w:val="NoSpacing"/>
+      </w:pPr>
+    </w:p>
+    <w:p>
+      <w:pPr>
+        <w:pStyle w:val="NoSpacing"/>
+      </w:pPr>
+      <w:r>
+        <w:t xml:space="preserve">Wouldwork has several available strategies for generating variables, depending on the requirements of the problem.  The default strategy, previously summarized in Part 1: </w:t>
       </w:r>
       <w:r>
         <w:rPr>
           <w:i/>
         </w:rPr>
-        <w:t>bind</w:t>
-      </w:r>
-      <w:r>
-        <w:t xml:space="preserve"> operator.  However, fluent variables can appear in action effect parameter lists to control how solution steps are printed, as mentioned above.  </w:t>
-      </w:r>
-    </w:p>
-    <w:p>
-      <w:pPr>
-        <w:pStyle w:val="NoSpacing"/>
-      </w:pPr>
-    </w:p>
-    <w:p>
-      <w:pPr>
-        <w:pStyle w:val="NoSpacing"/>
-      </w:pPr>
-      <w:r>
-        <w:t>In the case of overlapping types, as in a blocks world parameter list like (?block block ?support support), some supports are blocks (all supports except the table T) and all blocks are supports.  For this situation, the default is to generate only relevant combinations of a block and a support—eg, (A B) or (A T), but not (T A) or (T T) or (A A)—for checking in an action rule.  For example, in the default case, there is no need to include a statement like (different ?block ?support) in the body of a rule.</w:t>
-      </w:r>
-    </w:p>
-    <w:p>
-      <w:pPr>
-        <w:pStyle w:val="NoSpacing"/>
-      </w:pPr>
-    </w:p>
-    <w:p>
-      <w:pPr>
-        <w:pStyle w:val="NoSpacing"/>
-      </w:pPr>
-      <w:r>
-        <w:t>Whenever the precondition of an action is satisfied for a particular instantiation of its variables, those instantiations are then available for use in the action’s effect.  In the jugs example, all of the precondition variable instantiations for ?jug, $amt, and $cap are automatically passed to the effect, and therefore do not need to appear in the effect parameter list, unless needed to appropriately print out solution steps.</w:t>
-      </w:r>
-    </w:p>
-    <w:p>
-      <w:pPr>
-        <w:pStyle w:val="NoSpacing"/>
-      </w:pPr>
-    </w:p>
-    <w:p>
-      <w:pPr>
-        <w:pStyle w:val="NoSpacing"/>
-      </w:pPr>
-      <w:r>
-        <w:t xml:space="preserve">Wouldwork has several available strategies for generating variables, depending on the requirements of the problem.  The default strategy, previously summarized in Part 1: </w:t>
-      </w:r>
-      <w:r>
-        <w:rPr>
-          <w:i/>
-        </w:rPr>
         <w:t>Specifying Possible Actions</w:t>
       </w:r>
       <w:r>
-        <w:t>, effectively generates a list of all possible instantiations of each variable, but culls the list to include only unique instantiations.  That is, no two variables will be instantiated with the same value.  This comports with the common intuition that we give different names (in this case variable names) to different objects (as values).  For example if the parameter list is (?block block (?block-support ?support) support), there are three generating variables—?block, ?block-</w:t>
+        <w:t xml:space="preserve">, effectively generates a list of all possible instantiations of each variable, but culls the list to include only unique instantiations.  That is, no two variables will be instantiated with the same value.  This comports with the common intuition that we give different names (in this case variable names) to different objects (as values).  For example if the parameter list is (?block block (?block-support ?support) </w:t>
       </w:r>
       <w:r>
         <w:lastRenderedPageBreak/>
-        <w:t>support, and ?support—each of which can be instantiated with any of the instances from their respective types—block (A B C), block-support (A B C T), and support (A B C T).  Therefore by default, instantiations for the three variables are generated from the full cross-product of (block X block-support X support)minus any duplication of values = ((A B C) (A B T) (A C B) (A C T) (A T B) (A T C) (B A C) (B A T) (B C A) (B C T) (B T A) (B T C) (C A B) (C A T) (C B A) (C B T) (C T A) (C T B)).  The action rule or quantified formula is then checked for each such instantiation of the three (?) variables.</w:t>
+        <w:t>support), there are three generating variables—?block, ?block-support, and ?support—each of which can be instantiated with any of the instances from their respective types—block (A B C), block-support (A B C T), and support (A B C T).  Therefore by default, instantiations for the three variables are generated from the full cross-product of (block X block-support X support)minus any duplication of values = ((A B C) (A B T) (A C B) (A C T) (A T B) (A T C) (B A C) (B A T) (B C A) (B C T) (B T A) (B T C) (C A B) (C A T) (C B A) (C B T) (C T A) (C T B)).  The action rule or quantified formula is then checked for each such instantiation of the three (?) variables.</w:t>
       </w:r>
     </w:p>
     <w:p>
@@ -19109,7 +19106,7 @@
             <v:path o:extrusionok="f" gradientshapeok="t" o:connecttype="rect"/>
             <o:lock v:ext="edit" aspectratio="t"/>
           </v:shapetype>
-          <v:shape id="Object1" o:spid="_x0000_i1049" type="#_x0000_t75" style="width:237.15pt;height:226.35pt;visibility:visible;mso-wrap-style:square">
+          <v:shape id="Object1" o:spid="_x0000_i1025" type="#_x0000_t75" style="width:237.15pt;height:226.35pt;visibility:visible;mso-wrap-style:square">
             <v:imagedata r:id="rId14" o:title=""/>
           </v:shape>
         </w:pict>
@@ -21673,7 +21670,7 @@
       </w:pPr>
       <w:r>
         <w:pict w14:anchorId="28E486FE">
-          <v:shape id="Object2" o:spid="_x0000_i1050" type="#_x0000_t75" style="width:334.9pt;height:188.7pt;visibility:visible;mso-wrap-style:square">
+          <v:shape id="Object2" o:spid="_x0000_i1026" type="#_x0000_t75" style="width:334.9pt;height:188.7pt;visibility:visible;mso-wrap-style:square">
             <v:imagedata r:id="rId15" o:title=""/>
           </v:shape>
         </w:pict>
@@ -27036,7 +27033,7 @@
       </w:pPr>
       <w:r>
         <w:pict w14:anchorId="610D604C">
-          <v:shape id="Object3" o:spid="_x0000_i1051" type="#_x0000_t75" style="width:297.65pt;height:185.9pt;visibility:visible;mso-wrap-style:square">
+          <v:shape id="Object3" o:spid="_x0000_i1027" type="#_x0000_t75" style="width:297.65pt;height:185.9pt;visibility:visible;mso-wrap-style:square">
             <v:imagedata r:id="rId20" o:title=""/>
           </v:shape>
         </w:pict>

</xml_diff>

<commit_message>
safe symmetry wrap up
</commit_message>
<xml_diff>
--- a/Wouldwork User Manual(26.8).docx
+++ b/Wouldwork User Manual(26.8).docx
@@ -16623,17 +16623,7 @@
         <w:spacing w:after="0" w:line="240" w:lineRule="auto"/>
       </w:pPr>
       <w:r>
-        <w:t xml:space="preserve">When enabled, Wouldwork automatically analyzes your problem before search begins and identifies </w:t>
-      </w:r>
-      <w:r>
-        <w:rPr>
-          <w:i/>
-          <w:iCs/>
-        </w:rPr>
-        <w:t>symmetry groups</w:t>
-      </w:r>
-      <w:r>
-        <w:t>—sets of objects that are interchangeable based on their type, static relations, and whether they appear in the goal condition. Objects explicitly named in the goal are excluded from symmetry groups to ensure correctness.</w:t>
+        <w:t xml:space="preserve">When enabled, Wouldwork analyzes your problem before search begins and identifies symmetry families—sets of objects that are interchangeable based on their type, their static relations, and whether the goal names them. Objects explicitly named in the goal are excluded from symmetry families to ensure correctness.</w:t>
       </w:r>
     </w:p>
     <w:p>
@@ -16641,46 +16631,20 @@
         <w:pStyle w:val="Standard"/>
         <w:spacing w:after="0" w:line="240" w:lineRule="auto"/>
       </w:pPr>
-      <w:r>
-        <w:t>During problem initialization, Wouldwork reports detected symmetry groups:</w:t>
-      </w:r>
     </w:p>
     <w:p>
       <w:pPr>
         <w:pStyle w:val="Standard"/>
         <w:spacing w:after="0" w:line="240" w:lineRule="auto"/>
       </w:pPr>
-    </w:p>
-    <w:p>
-      <w:pPr>
-        <w:pStyle w:val="code"/>
-      </w:pPr>
-      <w:r>
-        <w:t>Symmetry groups detected: 1</w:t>
-      </w:r>
-    </w:p>
-    <w:p>
-      <w:pPr>
-        <w:pStyle w:val="code"/>
-      </w:pPr>
-      <w:r>
-        <w:t xml:space="preserve">  (C1 C2 C3 C4) [4 potentially interchangeable objects of type CONNECTOR]</w:t>
-      </w:r>
-    </w:p>
-    <w:p>
-      <w:pPr>
-        <w:pStyle w:val="code"/>
-      </w:pPr>
-      <w:r>
-        <w:t xml:space="preserve">  Search will prune equivalent paths that simply swap interchangeable objects.</w:t>
-      </w:r>
-    </w:p>
-    <w:p>
-      <w:pPr>
-        <w:pStyle w:val="code"/>
-      </w:pPr>
-      <w:r>
-        <w:t xml:space="preserve">  Strategy: Global — symmetric states are detected as duplicates in closed list and pruned.</w:t>
+      <w:r>
+        <w:rPr>
+          <w:b/>
+        </w:rPr>
+        <w:t xml:space="preserve">Safety check. </w:t>
+      </w:r>
+      <w:r>
+        <w:t xml:space="preserve">Merging two states that differ only by renaming interchangeable objects is correct only if nothing the search does next depends on which object has which name. So before keeping a family, Wouldwork follows its members through every action, query and update the search runs, through propagation, the goal, and the heuristic? and prune-state? hooks. A family is kept only if every use is known not to depend on names. Otherwise the family is dropped, the search runs without pruning it, and the report names the spot responsible. The check cannot be overridden: fix the flagged spot, or represent the objects without names (see Unnamed objects below). The bound hooks min-steps-remaining? and bounding-function? are not checked, since a bound that is valid for a state is valid for every renamed copy of it.</w:t>
       </w:r>
     </w:p>
     <w:p>
@@ -16695,11 +16659,7 @@
         <w:spacing w:after="0" w:line="240" w:lineRule="auto"/>
       </w:pPr>
       <w:r>
-        <w:t xml:space="preserve">Wouldwork automatically selects the appropriate pruning strategy based on the search mode. For graph search (*tree-or-graph* = graph), symmetric </w:t>
-      </w:r>
-      <w:r>
-        <w:lastRenderedPageBreak/>
-        <w:t>states are detected as duplicates in the closed list. For tree search, symmetric action instantiations are filtered at generation time.</w:t>
+        <w:t xml:space="preserve">During problem initialization, Wouldwork reports the safety check and the families kept, for example:</w:t>
       </w:r>
     </w:p>
     <w:p>
@@ -16707,8 +16667,58 @@
         <w:pStyle w:val="Standard"/>
         <w:spacing w:after="0" w:line="240" w:lineRule="auto"/>
       </w:pPr>
-      <w:r>
-        <w:t>At the end of a search, symmetry statistics appear in the output:</w:t>
+    </w:p>
+    <w:p>
+      <w:pPr>
+        <w:pStyle w:val="code"/>
+      </w:pPr>
+      <w:r>
+        <w:t xml:space="preserve">Symmetry safety check:</w:t>
+      </w:r>
+    </w:p>
+    <w:p>
+      <w:pPr>
+        <w:pStyle w:val="code"/>
+      </w:pPr>
+      <w:r>
+        <w:t xml:space="preserve">  ((CONNECTOR1) (CONNECTOR2) (CONNECTOR3)): kept; passes the full check</w:t>
+      </w:r>
+    </w:p>
+    <w:p>
+      <w:pPr>
+        <w:pStyle w:val="code"/>
+      </w:pPr>
+    </w:p>
+    <w:p>
+      <w:pPr>
+        <w:pStyle w:val="code"/>
+      </w:pPr>
+      <w:r>
+        <w:t xml:space="preserve">Symmetry families detected: 1</w:t>
+      </w:r>
+    </w:p>
+    <w:p>
+      <w:pPr>
+        <w:pStyle w:val="code"/>
+      </w:pPr>
+      <w:r>
+        <w:t xml:space="preserve">  ((CONNECTOR1) (CONNECTOR2) (CONNECTOR3)) [3 interchangeable rows of type CONNECTOR]</w:t>
+      </w:r>
+    </w:p>
+    <w:p>
+      <w:pPr>
+        <w:pStyle w:val="code"/>
+      </w:pPr>
+      <w:r>
+        <w:t xml:space="preserve">  Search will prune equivalent paths that simply swap interchangeable objects.</w:t>
+      </w:r>
+    </w:p>
+    <w:p>
+      <w:pPr>
+        <w:pStyle w:val="code"/>
+      </w:pPr>
+      <w:r>
+        <w:t xml:space="preserve">  Strategy: Global — symmetric states are detected as duplicates in closed list and pruned.</w:t>
       </w:r>
     </w:p>
     <w:p>
@@ -16719,25 +16729,98 @@
     </w:p>
     <w:p>
       <w:pPr>
-        <w:pStyle w:val="code"/>
-      </w:pPr>
-      <w:r>
-        <w:t>Symmetry: 847 canonical duplicates pruned (23.4% of repeated states)</w:t>
-      </w:r>
-    </w:p>
-    <w:p>
-      <w:pPr>
         <w:pStyle w:val="Standard"/>
         <w:spacing w:after="0" w:line="240" w:lineRule="auto"/>
       </w:pPr>
+      <w:r>
+        <w:t xml:space="preserve">Each row holds the objects that are exchanged together; for an ordinary family a row is a single object. A dropped family is listed with the spots that flagged it, for example:</w:t>
+      </w:r>
     </w:p>
     <w:p>
       <w:pPr>
         <w:pStyle w:val="Standard"/>
         <w:spacing w:after="0" w:line="240" w:lineRule="auto"/>
       </w:pPr>
-      <w:r>
-        <w:t>Symmetry pruning carries significant overhead checking, but is most beneficial when:</w:t>
+    </w:p>
+    <w:p>
+      <w:pPr>
+        <w:pStyle w:val="code"/>
+      </w:pPr>
+      <w:r>
+        <w:t xml:space="preserve">  ((TOKEN1) (TOKEN2)): dropped; the full check flags it</w:t>
+      </w:r>
+    </w:p>
+    <w:p>
+      <w:pPr>
+        <w:pStyle w:val="code"/>
+      </w:pPr>
+      <w:r>
+        <w:t xml:space="preserve">      gethash receives ?token, in query token-priority</w:t>
+      </w:r>
+    </w:p>
+    <w:p>
+      <w:pPr>
+        <w:pStyle w:val="Standard"/>
+        <w:spacing w:after="0" w:line="240" w:lineRule="auto"/>
+      </w:pPr>
+    </w:p>
+    <w:p>
+      <w:pPr>
+        <w:pStyle w:val="Standard"/>
+        <w:spacing w:after="0" w:line="240" w:lineRule="auto"/>
+      </w:pPr>
+      <w:r>
+        <w:t xml:space="preserve">If families were detected but none was kept, Wouldwork reports "No symmetry family passed the safety check; search runs without symmetry pruning." If none was detected, it reports this and suggests disabling symmetry pruning for greater efficiency. To see the safety check for the staged problem without turning symmetry pruning on, enter (report-symmetry-safety) at the REPL.</w:t>
+      </w:r>
+    </w:p>
+    <w:p>
+      <w:pPr>
+        <w:pStyle w:val="Standard"/>
+        <w:spacing w:after="0" w:line="240" w:lineRule="auto"/>
+      </w:pPr>
+    </w:p>
+    <w:p>
+      <w:pPr>
+        <w:pStyle w:val="Standard"/>
+        <w:spacing w:after="0" w:line="240" w:lineRule="auto"/>
+      </w:pPr>
+      <w:r>
+        <w:t xml:space="preserve">Wouldwork automatically selects the appropriate pruning strategy based on the search mode. For graph search (*tree-or-graph* = graph), symmetric states are detected as duplicates in the closed list. For tree search, symmetric action instantiations are filtered at generation time. At the end of a search, symmetry statistics appear in the output:</w:t>
+      </w:r>
+    </w:p>
+    <w:p>
+      <w:pPr>
+        <w:pStyle w:val="Standard"/>
+        <w:spacing w:after="0" w:line="240" w:lineRule="auto"/>
+      </w:pPr>
+    </w:p>
+    <w:p>
+      <w:pPr>
+        <w:pStyle w:val="code"/>
+      </w:pPr>
+      <w:r>
+        <w:t xml:space="preserve">Symmetry: 847 canonical duplicates pruned (2.3% of total states)</w:t>
+      </w:r>
+    </w:p>
+    <w:p>
+      <w:pPr>
+        <w:pStyle w:val="Standard"/>
+        <w:spacing w:after="0" w:line="240" w:lineRule="auto"/>
+      </w:pPr>
+    </w:p>
+    <w:p>
+      <w:pPr>
+        <w:pStyle w:val="Standard"/>
+        <w:spacing w:after="0" w:line="240" w:lineRule="auto"/>
+      </w:pPr>
+      <w:r>
+        <w:rPr>
+          <w:b/>
+        </w:rPr>
+        <w:t xml:space="preserve">Writing code for interchangeable objects. </w:t>
+      </w:r>
+      <w:r>
+        <w:t xml:space="preserve">Members of a kept family may appear anywhere in spec code. Spec loops over a family (doall, exists, forall, and lists built from them) visit its members in an order fixed by the state itself rather than by name, so a "first one found" rule picks the same physical object in every renamed copy of a state. The safety check flags:</w:t>
       </w:r>
     </w:p>
     <w:p>
@@ -16750,6 +16833,111 @@
         <w:spacing w:after="0" w:line="240" w:lineRule="auto"/>
       </w:pPr>
       <w:r>
+        <w:t xml:space="preserve">passing a member to plain Lisp (a defun or define-problem-helper), directly or inside a list, or giving plain Lisp the state for anything other than handing it on to a query or update;</w:t>
+      </w:r>
+    </w:p>
+    <w:p>
+      <w:pPr>
+        <w:pStyle w:val="Standard"/>
+        <w:numPr>
+          <w:ilvl w:val="0"/>
+          <w:numId w:val="39"/>
+        </w:numPr>
+        <w:spacing w:after="0" w:line="240" w:lineRule="auto"/>
+      </w:pPr>
+      <w:r>
+        <w:t xml:space="preserve">writing a member’s name as a literal in an action, query, update, or the goal;</w:t>
+      </w:r>
+    </w:p>
+    <w:p>
+      <w:pPr>
+        <w:pStyle w:val="Standard"/>
+        <w:numPr>
+          <w:ilvl w:val="0"/>
+          <w:numId w:val="39"/>
+        </w:numPr>
+        <w:spacing w:after="0" w:line="240" w:lineRule="auto"/>
+      </w:pPr>
+      <w:r>
+        <w:t xml:space="preserve">quantifying over the family with dot-product.</w:t>
+      </w:r>
+    </w:p>
+    <w:p>
+      <w:pPr>
+        <w:pStyle w:val="Standard"/>
+        <w:spacing w:after="0" w:line="240" w:lineRule="auto"/>
+      </w:pPr>
+      <w:r>
+        <w:t xml:space="preserve">When several members qualify for a choice, break the tie by facts the state holds, or collect every tie and signal an error when more than one remains; never choose by name or printed text. The rules for Talos technology code are in tech/README.html, under "Writing symmetry-safe tech".</w:t>
+      </w:r>
+    </w:p>
+    <w:p>
+      <w:pPr>
+        <w:pStyle w:val="Standard"/>
+        <w:spacing w:after="0" w:line="240" w:lineRule="auto"/>
+      </w:pPr>
+    </w:p>
+    <w:p>
+      <w:pPr>
+        <w:pStyle w:val="Standard"/>
+        <w:spacing w:after="0" w:line="240" w:lineRule="auto"/>
+      </w:pPr>
+      <w:r>
+        <w:rPr>
+          <w:b/>
+        </w:rPr>
+        <w:t xml:space="preserve">Unnamed objects. </w:t>
+      </w:r>
+      <w:r>
+        <w:t xml:space="preserve">When objects are interchangeable by construction and a flagged spot cannot be rewritten, leave them unnamed: rather than recording where each named object is, record one fact per occupied place. Renamed copies of a state are then already identical, so no symmetry pruning is needed. problem-fox-geese names its geese and relies on symmetry pruning; problem-fox-geese-geese-check represents the same geese unnamed, with symmetry pruning off.</w:t>
+      </w:r>
+    </w:p>
+    <w:p>
+      <w:pPr>
+        <w:pStyle w:val="Standard"/>
+        <w:spacing w:after="0" w:line="240" w:lineRule="auto"/>
+      </w:pPr>
+    </w:p>
+    <w:p>
+      <w:pPr>
+        <w:pStyle w:val="Standard"/>
+        <w:spacing w:after="0" w:line="240" w:lineRule="auto"/>
+      </w:pPr>
+      <w:r>
+        <w:rPr>
+          <w:b/>
+        </w:rPr>
+        <w:t xml:space="preserve">Checking the engine. </w:t>
+      </w:r>
+      <w:r>
+        <w:t xml:space="preserve">(audit-symmetry) searches the staged problem twice, with symmetry pruning on and then off, and signals an error if the outcome or the best solution value differs. It needs symmetry pruning on with at least one kept family, and *solution-type* min-length, min-time, min-value, max-value, or first (for first, only whether a solution was found is compared). Solution counts are not compared, since pruning legitimately drops solutions that differ only by renaming. On a goal-chained problem it covers the current subgoal only. It runs the search twice, so use a small instance or a modest depth cutoff.</w:t>
+      </w:r>
+    </w:p>
+    <w:p>
+      <w:pPr>
+        <w:pStyle w:val="Standard"/>
+        <w:spacing w:after="0" w:line="240" w:lineRule="auto"/>
+      </w:pPr>
+    </w:p>
+    <w:p>
+      <w:pPr>
+        <w:pStyle w:val="Standard"/>
+        <w:spacing w:after="0" w:line="240" w:lineRule="auto"/>
+      </w:pPr>
+      <w:r>
+        <w:t>Symmetry pruning carries significant overhead checking, but is most beneficial when:</w:t>
+      </w:r>
+    </w:p>
+    <w:p>
+      <w:pPr>
+        <w:pStyle w:val="Standard"/>
+        <w:numPr>
+          <w:ilvl w:val="0"/>
+          <w:numId w:val="39"/>
+        </w:numPr>
+        <w:spacing w:after="0" w:line="240" w:lineRule="auto"/>
+      </w:pPr>
+      <w:r>
         <w:t>Your problem has multiple objects of the same type with identical initial properties</w:t>
       </w:r>
     </w:p>
@@ -16777,21 +16965,6 @@
       </w:pPr>
       <w:r>
         <w:t>The search space is large enough that pruning redundant paths provides a measurable benefit</w:t>
-      </w:r>
-    </w:p>
-    <w:p>
-      <w:pPr>
-        <w:pStyle w:val="Standard"/>
-        <w:spacing w:after="0" w:line="240" w:lineRule="auto"/>
-      </w:pPr>
-    </w:p>
-    <w:p>
-      <w:pPr>
-        <w:pStyle w:val="Standard"/>
-        <w:spacing w:after="0" w:line="240" w:lineRule="auto"/>
-      </w:pPr>
-      <w:r>
-        <w:t>If no symmetry groups are detected, Wouldwork will report this and suggest disabling symmetry pruning for greater efficiency.</w:t>
       </w:r>
     </w:p>
     <w:p>

</xml_diff>